<commit_message>
feat: initialize Flutter project structure for frontend
</commit_message>
<xml_diff>
--- a/document/Idea.docx
+++ b/document/Idea.docx
@@ -142,6 +142,9 @@
     </w:p>
     <w:p>
       <w:r>
+        <w:rPr>
+          <w:noProof/>
+        </w:rPr>
         <w:drawing>
           <wp:inline distT="0" distB="0" distL="0" distR="0" wp14:anchorId="7ACEE75F" wp14:editId="37C57E42">
             <wp:extent cx="5943600" cy="3307715"/>
@@ -564,24 +567,97 @@
         <w:rPr>
           <w:rStyle w:val="hljs-string"/>
         </w:rPr>
-        <w:t>"Feat: Initializ</w:t>
+        <w:t>"</w:t>
+      </w:r>
+      <w:r>
+        <w:t>feat: initialize Flutter project structure for frontend</w:t>
       </w:r>
       <w:r>
         <w:rPr>
           <w:rStyle w:val="hljs-string"/>
         </w:rPr>
-        <w:t>e</w:t>
+        <w:t xml:space="preserve"> </w:t>
       </w:r>
       <w:r>
         <w:rPr>
           <w:rStyle w:val="hljs-string"/>
         </w:rPr>
-        <w:t xml:space="preserve"> app structure and boilerplate code"</w:t>
+        <w:t>"</w:t>
+      </w:r>
+    </w:p>
+    <w:p>
+      <w:pPr>
+        <w:rPr>
+          <w:b/>
+          <w:bCs/>
+        </w:rPr>
+      </w:pPr>
+      <w:r>
+        <w:rPr>
+          <w:b/>
+          <w:bCs/>
+        </w:rPr>
+        <w:t># Tiếp đó rẽ nhánh feature để code Version 0 (UI Lock)</w:t>
+      </w:r>
+    </w:p>
+    <w:p>
+      <w:r>
+        <w:t>git checkout -b feature/v0-ui-mockup</w:t>
+      </w:r>
+    </w:p>
+    <w:p>
+      <w:r>
+        <w:t># Tiến hành vào code các màn hình login, register, chat UI với fake data...</w:t>
+      </w:r>
+    </w:p>
+    <w:p>
+      <w:r>
+        <w:t># Code xong thì commit trên nhánh feature này:</w:t>
+      </w:r>
+    </w:p>
+    <w:p>
+      <w:r>
+        <w:t>git add .</w:t>
+      </w:r>
+    </w:p>
+    <w:p>
+      <w:r>
+        <w:t>git commit -m "feat(frontend): complete login, register and chat UI with fake data"</w:t>
+      </w:r>
+    </w:p>
+    <w:p>
+      <w:r>
+        <w:t># Gộp về develop khi xong Version 0</w:t>
+      </w:r>
+    </w:p>
+    <w:p>
+      <w:r>
+        <w:t>git checkout develop</w:t>
+      </w:r>
+    </w:p>
+    <w:p>
+      <w:r>
+        <w:t>git merge feature/v0-ui-mockup</w:t>
       </w:r>
     </w:p>
     <w:p/>
     <w:p>
       <w:r>
+        <w:t xml:space="preserve"># </w:t>
+      </w:r>
+      <w:r>
+        <w:t>Sang Version 1 (MVP) có database và BE</w:t>
+      </w:r>
+    </w:p>
+    <w:p>
+      <w:r>
+        <w:lastRenderedPageBreak/>
+        <w:t>- Từ develop rẽ 1 nhánh mới là feature/v1-mvp-backend, gõ lệnh khởi tạo Laravel, tạo database, script. Xong xuôi thì merge ngược về develop.</w:t>
+      </w:r>
+    </w:p>
+    <w:p/>
+    <w:p>
+      <w:r>
         <w:t>---</w:t>
       </w:r>
     </w:p>
@@ -663,7 +739,6 @@
     </w:p>
     <w:p>
       <w:r>
-        <w:lastRenderedPageBreak/>
         <w:t>git push origin v0.1</w:t>
       </w:r>
     </w:p>
@@ -786,6 +861,7 @@
     <w:p/>
     <w:p>
       <w:r>
+        <w:lastRenderedPageBreak/>
         <w:t>- Các chức năng cần có và thông tin cụ thể:</w:t>
       </w:r>
     </w:p>
@@ -1039,15 +1115,11 @@
         <w:t xml:space="preserve"> vui lòng nhập nhập lại mật khẩu -</w:t>
       </w:r>
       <w:r>
-        <w:t xml:space="preserve"> </w:t>
-      </w:r>
-      <w:r>
-        <w:t>nhập lại mật khẩu cần trùng khớp mật khẩu.</w:t>
-      </w:r>
-    </w:p>
-    <w:p>
-      <w:r>
-        <w:lastRenderedPageBreak/>
+        <w:t xml:space="preserve"> nhập lại mật khẩu cần trùng khớp mật khẩu.</w:t>
+      </w:r>
+    </w:p>
+    <w:p>
+      <w:r>
         <w:t>+ Tầng 3:</w:t>
       </w:r>
       <w:r>
@@ -1207,6 +1279,7 @@
     </w:p>
     <w:p>
       <w:r>
+        <w:lastRenderedPageBreak/>
         <w:t>- Đăng nhập thành công vào trang chủ luôn.</w:t>
       </w:r>
     </w:p>
@@ -1283,19 +1356,12 @@
     </w:p>
     <w:p>
       <w:r>
-        <w:t xml:space="preserve">+ Tầng 2: Bấm vào nút tiếp tục, hiển thị lỗi validate đỏ ở dưới trường nhập: vui lòng nhập email – email theo dạng: </w:t>
-      </w:r>
-      <w:r>
-        <w:t>[name]@[domain].[domain-name]</w:t>
-      </w:r>
-    </w:p>
-    <w:p>
-      <w:r>
-        <w:lastRenderedPageBreak/>
-        <w:t xml:space="preserve">+ Tầng 3: Bấm vào nút tiếp tục, </w:t>
-      </w:r>
-      <w:r>
-        <w:t>lấy dữ liệu sau khi xóa khoảng trống đầu và cuối (trim), kiểm tra qua mock data. Báo lỗi đỏ ở trên cùng chính giữa: email</w:t>
+        <w:t>+ Tầng 2: Bấm vào nút tiếp tục, hiển thị lỗi validate đỏ ở dưới trường nhập: vui lòng nhập email – email theo dạng: [name]@[domain].[domain-name]</w:t>
+      </w:r>
+    </w:p>
+    <w:p>
+      <w:r>
+        <w:t>+ Tầng 3: Bấm vào nút tiếp tục, lấy dữ liệu sau khi xóa khoảng trống đầu và cuối (trim), kiểm tra qua mock data. Báo lỗi đỏ ở trên cùng chính giữa: email</w:t>
       </w:r>
       <w:r>
         <w:t xml:space="preserve"> chưa được dùng để đăng ký, vui lòng thử lại.</w:t>
@@ -1515,6 +1581,7 @@
     </w:p>
     <w:p>
       <w:r>
+        <w:lastRenderedPageBreak/>
         <w:t>- Trang chủ: Thanh tìm kiếm</w:t>
       </w:r>
       <w:r>
@@ -1527,10 +1594,7 @@
         <w:t>ch</w:t>
       </w:r>
       <w:r>
-        <w:t>ung cho các mục. Than</w:t>
-      </w:r>
-      <w:r>
-        <w:t>h Navigation Bar ở dưới cùng, gồm 2 mục nhắn tin và kết bạn, chung cho các mục.</w:t>
+        <w:t>ung cho các mục. Thanh Navigation Bar ở dưới cùng, gồm 2 mục nhắn tin và kết bạn, chung cho các mục.</w:t>
       </w:r>
     </w:p>
     <w:p>
@@ -1633,7 +1697,6 @@
     </w:p>
     <w:p>
       <w:r>
-        <w:lastRenderedPageBreak/>
         <w:t xml:space="preserve">- </w:t>
       </w:r>
       <w:r>
@@ -1816,6 +1879,7 @@
     </w:p>
     <w:p>
       <w:r>
+        <w:lastRenderedPageBreak/>
         <w:t>+ Tầng 3: Kích hoạt nút lưu. Hiển thị thông báo lỗi: Mật khẩu cũ không đúng / Mật khẩu mới không được trùng mật khẩu cũ.</w:t>
       </w:r>
     </w:p>
@@ -2388,6 +2452,7 @@
   <w:style w:type="character" w:default="1" w:styleId="DefaultParagraphFont">
     <w:name w:val="Default Paragraph Font"/>
     <w:uiPriority w:val="1"/>
+    <w:semiHidden/>
     <w:unhideWhenUsed/>
   </w:style>
   <w:style w:type="table" w:default="1" w:styleId="TableNormal">

</xml_diff>

<commit_message>
chore: setup Flutter project architecture (clean architecture)
</commit_message>
<xml_diff>
--- a/document/Idea.docx
+++ b/document/Idea.docx
@@ -1711,6 +1711,9 @@
       <w:r>
         <w:t xml:space="preserve"> Khi bấm vào sẽ chuyển qua trang Nhắn tin.</w:t>
       </w:r>
+      <w:r>
+        <w:t xml:space="preserve"> Nếu không có tin nhắn thì hiển thị Chưa có tin nhắn nào cho đoạn tin. Chỉ có bạn bè mới hiển thị đoạn tin nhắn ở đây.</w:t>
+      </w:r>
     </w:p>
     <w:p>
       <w:pPr>
@@ -1818,13 +1821,16 @@
         <w:pStyle w:val="Heading4"/>
       </w:pPr>
       <w:r>
-        <w:t xml:space="preserve"> </w:t>
-      </w:r>
-      <w:r>
         <w:t>1.7. Chức năng đổi mật khẩu</w:t>
       </w:r>
       <w:r>
-        <w:t xml:space="preserve"> – Trang </w:t>
+        <w:t xml:space="preserve"> – Trang</w:t>
+      </w:r>
+      <w:r>
+        <w:t xml:space="preserve"> Settings + Trang</w:t>
+      </w:r>
+      <w:r>
+        <w:t xml:space="preserve"> </w:t>
       </w:r>
       <w:r>
         <w:t>đổi mật khẩu</w:t>
@@ -1874,12 +1880,12 @@
     </w:p>
     <w:p>
       <w:r>
+        <w:lastRenderedPageBreak/>
         <w:t>+ Tầng 2: Kích hoạt nút lưu. Validate lỗi chữ đỏ phía dưới field nhập: vui lòng nhập mật khẩu - nhập lại mật khẩu mới / nhập lại mật khẩu mới không khớp.</w:t>
       </w:r>
     </w:p>
     <w:p>
       <w:r>
-        <w:lastRenderedPageBreak/>
         <w:t>+ Tầng 3: Kích hoạt nút lưu. Hiển thị thông báo lỗi: Mật khẩu cũ không đúng / Mật khẩu mới không được trùng mật khẩu cũ.</w:t>
       </w:r>
     </w:p>
@@ -1931,7 +1937,89 @@
         <w:t xml:space="preserve"> Thoát ra trang đăng nhập</w:t>
       </w:r>
     </w:p>
-    <w:p/>
+    <w:p>
+      <w:pPr>
+        <w:pStyle w:val="Heading4"/>
+      </w:pPr>
+      <w:r>
+        <w:t>1.9. Chức năng xóa bạn</w:t>
+      </w:r>
+      <w:r>
+        <w:t xml:space="preserve"> – Trang chủ</w:t>
+      </w:r>
+    </w:p>
+    <w:p>
+      <w:r>
+        <w:t>- Ở mục Nhắn tin, phần top 30 đoạn tin nhắn, hiển thị dấu 3 chấm cuối đoạn, bấm vào sẽ hiện lựa chọn Hủy kết bạn, bấm vào sẽ hiện Modal xác nhận hủy kết bạn.</w:t>
+      </w:r>
+      <w:r>
+        <w:t xml:space="preserve"> Nếu có thì xóa đoạn tin nhắn khỏi danh sách</w:t>
+      </w:r>
+      <w:r>
+        <w:t xml:space="preserve"> và hủy kết bạn</w:t>
+      </w:r>
+      <w:r>
+        <w:t>, nhưng giữ lại nội dung đoạn tin.</w:t>
+      </w:r>
+    </w:p>
+    <w:p>
+      <w:pPr>
+        <w:pStyle w:val="Heading4"/>
+      </w:pPr>
+      <w:r>
+        <w:t xml:space="preserve">1.10. Chức năng </w:t>
+      </w:r>
+      <w:r>
+        <w:t>thu hồi</w:t>
+      </w:r>
+      <w:r>
+        <w:t xml:space="preserve"> tin nhắn – Trang nhắn tin</w:t>
+      </w:r>
+    </w:p>
+    <w:p>
+      <w:r>
+        <w:t xml:space="preserve">- Nhấn giữ tin nhắn cần thu hồi của bản thân, chọn thu hồi ở phần modal hiện ra </w:t>
+      </w:r>
+      <w:r>
+        <w:sym w:font="Wingdings" w:char="F0E0"/>
+      </w:r>
+      <w:r>
+        <w:t xml:space="preserve"> Đổi nội dung tin nhắn thành Tin nhắn đã được thu hồi.</w:t>
+      </w:r>
+    </w:p>
+    <w:p>
+      <w:pPr>
+        <w:pStyle w:val="Heading4"/>
+      </w:pPr>
+      <w:r>
+        <w:t>1.11. Chức năng</w:t>
+      </w:r>
+      <w:r>
+        <w:t xml:space="preserve"> đổi ngôn ngữ  - Trang Settings + Trang đổi ngôn ngữ</w:t>
+      </w:r>
+    </w:p>
+    <w:p>
+      <w:r>
+        <w:t xml:space="preserve">- Bấm Settings </w:t>
+      </w:r>
+      <w:r>
+        <w:sym w:font="Wingdings" w:char="F0E0"/>
+      </w:r>
+      <w:r>
+        <w:t xml:space="preserve"> Đổi ngôn ngữ</w:t>
+      </w:r>
+    </w:p>
+    <w:p>
+      <w:r>
+        <w:t xml:space="preserve">- Chọn ngôn ngữ cần đổi, hiện Modal xác nhận đổi ngôn ngữ </w:t>
+      </w:r>
+      <w:r>
+        <w:sym w:font="Wingdings" w:char="F0E0"/>
+      </w:r>
+      <w:r>
+        <w:t xml:space="preserve"> Thoát ra trang chủ.</w:t>
+      </w:r>
+    </w:p>
     <w:sectPr>
       <w:type w:val="continuous"/>
       <w:pgSz w:w="12240" w:h="15840"/>

</xml_diff>